<commit_message>
revisa manual onboarding shopee operacional
</commit_message>
<xml_diff>
--- a/outputs/manual-onboarding-analista-shopee-budamix.docx
+++ b/outputs/manual-onboarding-analista-shopee-budamix.docx
@@ -26,7 +26,7 @@
           <w:color w:val="5A5A5A"/>
           <w:sz w:val="24"/>
         </w:rPr>
-        <w:t>Rotina diária para budamix.shop, budamix.store e budamix_store</w:t>
+        <w:t>Rotina operacional das contas budamix.shop, budamix.store e budamix_store</w:t>
       </w:r>
     </w:p>
     <w:p>
@@ -82,7 +82,7 @@
               <w:spacing w:after="40"/>
             </w:pPr>
             <w:r>
-              <w:t>• Ajudar você a trabalhar no dia a dia das 3 contas Shopee.</w:t>
+              <w:t>• Ajudar você a operar as 3 contas Shopee no dia a dia.</w:t>
             </w:r>
           </w:p>
           <w:p>
@@ -90,7 +90,7 @@
               <w:spacing w:after="40"/>
             </w:pPr>
             <w:r>
-              <w:t>• Mostrar o que olhar, quando agir e quando pedir ajuda.</w:t>
+              <w:t>• Mostrar o que olhar, o que registrar e quando pedir ajuda.</w:t>
             </w:r>
           </w:p>
           <w:p>
@@ -98,7 +98,7 @@
               <w:spacing w:after="40"/>
             </w:pPr>
             <w:r>
-              <w:t>• Evitar excesso de detalhe técnico no começo.</w:t>
+              <w:t>• Manter o foco em operação. A análise financeira fica com o Pedro.</w:t>
             </w:r>
           </w:p>
         </w:tc>
@@ -122,7 +122,7 @@
         <w:rPr>
           <w:b w:val="0"/>
         </w:rPr>
-        <w:t>Você vai acompanhar a operação da Shopee da Budamix em 3 contas.</w:t>
+        <w:t>Você vai acompanhar a operação diária da Shopee da Budamix em 3 contas.</w:t>
       </w:r>
     </w:p>
     <w:p>
@@ -133,7 +133,7 @@
         <w:rPr>
           <w:b w:val="0"/>
         </w:rPr>
-        <w:t>As 3 contas vendem produtos parecidos, mas não devem ser analisadas como uma coisa só.</w:t>
+        <w:t>As 3 contas podem vender produtos parecidos, mas precisam ser olhadas separadamente.</w:t>
       </w:r>
     </w:p>
     <w:tbl>
@@ -213,7 +213,7 @@
                 <w:color w:val="FFFFFF"/>
                 <w:sz w:val="19"/>
               </w:rPr>
-              <w:t>Atenção principal</w:t>
+              <w:t>Ponto de atenção</w:t>
             </w:r>
           </w:p>
         </w:tc>
@@ -275,7 +275,7 @@
                 <w:b w:val="0"/>
                 <w:sz w:val="19"/>
               </w:rPr>
-              <w:t>Maior volume. Comparar todo dia.</w:t>
+              <w:t>Maior volume. Olhar todo dia.</w:t>
             </w:r>
           </w:p>
         </w:tc>
@@ -337,7 +337,7 @@
                 <w:b w:val="0"/>
                 <w:sz w:val="19"/>
               </w:rPr>
-              <w:t>Olhar reação de campanhas e giro.</w:t>
+              <w:t>Acompanhar giro e campanhas.</w:t>
             </w:r>
           </w:p>
         </w:tc>
@@ -399,7 +399,7 @@
                 <w:b w:val="0"/>
                 <w:sz w:val="19"/>
               </w:rPr>
-              <w:t>Cuidar para não ficar para trás.</w:t>
+              <w:t>Não deixar ficar para trás.</w:t>
             </w:r>
           </w:p>
         </w:tc>
@@ -435,7 +435,7 @@
               <w:spacing w:after="40"/>
             </w:pPr>
             <w:r>
-              <w:t>• Nunca diga “a Shopee caiu” olhando só uma conta.</w:t>
+              <w:t>• Nunca trate as 3 contas como uma coisa só.</w:t>
             </w:r>
           </w:p>
           <w:p>
@@ -443,7 +443,7 @@
               <w:spacing w:after="40"/>
             </w:pPr>
             <w:r>
-              <w:t>• Sempre diga qual conta caiu ou subiu.</w:t>
+              <w:t>• Sempre diga qual conta teve problema ou melhora.</w:t>
             </w:r>
           </w:p>
           <w:p>
@@ -451,7 +451,7 @@
               <w:spacing w:after="40"/>
             </w:pPr>
             <w:r>
-              <w:t>• Só fale da Shopee total quando 2 ou 3 contas mostram o mesmo sinal.</w:t>
+              <w:t>• Só fale “Shopee total” quando estiver olhando as 3 contas juntas.</w:t>
             </w:r>
           </w:p>
         </w:tc>
@@ -464,7 +464,7 @@
         <w:spacing w:before="240" w:after="120"/>
       </w:pPr>
       <w:r>
-        <w:t>2. Rotina diária</w:t>
+        <w:t>2. O que vem do Pedro todos os dias</w:t>
       </w:r>
     </w:p>
     <w:p>
@@ -475,75 +475,7 @@
         <w:rPr>
           <w:b w:val="0"/>
         </w:rPr>
-        <w:t>Faça essa rotina todos os dias úteis, de preferência no começo da manhã.</w:t>
-      </w:r>
-    </w:p>
-    <w:p>
-      <w:pPr>
-        <w:pStyle w:val="Heading2"/>
-        <w:spacing w:before="160" w:after="80"/>
-      </w:pPr>
-      <w:r>
-        <w:t>2.1. Abrir as 3 contas</w:t>
-      </w:r>
-    </w:p>
-    <w:p>
-      <w:pPr>
-        <w:pStyle w:val="ListBullet"/>
-        <w:spacing w:after="60"/>
-        <w:ind w:left="317"/>
-      </w:pPr>
-      <w:r>
-        <w:t>Entrar no Seller Center de cada conta.</w:t>
-      </w:r>
-    </w:p>
-    <w:p>
-      <w:pPr>
-        <w:pStyle w:val="ListBullet"/>
-        <w:spacing w:after="60"/>
-        <w:ind w:left="317"/>
-      </w:pPr>
-      <w:r>
-        <w:t>Conferir pedidos novos.</w:t>
-      </w:r>
-    </w:p>
-    <w:p>
-      <w:pPr>
-        <w:pStyle w:val="ListBullet"/>
-        <w:spacing w:after="60"/>
-        <w:ind w:left="317"/>
-      </w:pPr>
-      <w:r>
-        <w:t>Conferir mensagens pendentes.</w:t>
-      </w:r>
-    </w:p>
-    <w:p>
-      <w:pPr>
-        <w:pStyle w:val="ListBullet"/>
-        <w:spacing w:after="60"/>
-        <w:ind w:left="317"/>
-      </w:pPr>
-      <w:r>
-        <w:t>Conferir notificações da Shopee.</w:t>
-      </w:r>
-    </w:p>
-    <w:p>
-      <w:pPr>
-        <w:pStyle w:val="ListBullet"/>
-        <w:spacing w:after="60"/>
-        <w:ind w:left="317"/>
-      </w:pPr>
-      <w:r>
-        <w:t>Conferir produtos com problema, pausados ou sem estoque.</w:t>
-      </w:r>
-    </w:p>
-    <w:p>
-      <w:pPr>
-        <w:pStyle w:val="Heading2"/>
-        <w:spacing w:before="160" w:after="80"/>
-      </w:pPr>
-      <w:r>
-        <w:t>2.2. Ver vendas do dia anterior</w:t>
+        <w:t>O Pedro enviará diariamente uma análise de performance de cada conta, referente ao dia anterior.</w:t>
       </w:r>
     </w:p>
     <w:p>
@@ -554,17 +486,26 @@
         <w:rPr>
           <w:b w:val="0"/>
         </w:rPr>
-        <w:t>Para cada conta, anotar:</w:t>
+        <w:t>Essa análise deve ser usada como guia para o seu trabalho do dia.</w:t>
       </w:r>
     </w:p>
     <w:p>
       <w:pPr>
+        <w:pStyle w:val="Heading2"/>
+        <w:spacing w:before="160" w:after="80"/>
+      </w:pPr>
+      <w:r>
+        <w:t>Ao receber a análise diária</w:t>
+      </w:r>
+    </w:p>
+    <w:p>
+      <w:pPr>
         <w:pStyle w:val="ListBullet"/>
         <w:spacing w:after="60"/>
         <w:ind w:left="317"/>
       </w:pPr>
       <w:r>
-        <w:t>Faturamento bruto.</w:t>
+        <w:t>Leia primeiro o resumo de cada conta.</w:t>
       </w:r>
     </w:p>
     <w:p>
@@ -574,7 +515,7 @@
         <w:ind w:left="317"/>
       </w:pPr>
       <w:r>
-        <w:t>Quantidade de pedidos.</w:t>
+        <w:t>Veja quais produtos ou anúncios foram citados.</w:t>
       </w:r>
     </w:p>
     <w:p>
@@ -584,7 +525,7 @@
         <w:ind w:left="317"/>
       </w:pPr>
       <w:r>
-        <w:t>Ticket médio.</w:t>
+        <w:t>Separe os pontos que precisam de conferência no Seller Center.</w:t>
       </w:r>
     </w:p>
     <w:p>
@@ -594,7 +535,7 @@
         <w:ind w:left="317"/>
       </w:pPr>
       <w:r>
-        <w:t>Produtos mais vendidos.</w:t>
+        <w:t>Confirme se há ação operacional para fazer.</w:t>
       </w:r>
     </w:p>
     <w:p>
@@ -604,17 +545,7 @@
         <w:ind w:left="317"/>
       </w:pPr>
       <w:r>
-        <w:t>Pedidos cancelados ou devolvidos.</w:t>
-      </w:r>
-    </w:p>
-    <w:p>
-      <w:pPr>
-        <w:pStyle w:val="ListBullet"/>
-        <w:spacing w:after="60"/>
-        <w:ind w:left="317"/>
-      </w:pPr>
-      <w:r>
-        <w:t>Se as vendas foram por Shopee Full ou envio normal.</w:t>
+        <w:t>Se algo não estiver claro, pergunte antes de mexer.</w:t>
       </w:r>
     </w:p>
     <w:tbl>
@@ -638,7 +569,7 @@
                 <w:color w:val="174C4C"/>
                 <w:sz w:val="21"/>
               </w:rPr>
-              <w:t>Como comparar</w:t>
+              <w:t>Importante</w:t>
             </w:r>
           </w:p>
           <w:p>
@@ -646,7 +577,7 @@
               <w:spacing w:after="40"/>
             </w:pPr>
             <w:r>
-              <w:t>• Compare cada conta com ela mesma.</w:t>
+              <w:t>• A análise do Pedro não é para você refazer.</w:t>
             </w:r>
           </w:p>
           <w:p>
@@ -654,7 +585,7 @@
               <w:spacing w:after="40"/>
             </w:pPr>
             <w:r>
-              <w:t>• Olhe contra ontem.</w:t>
+              <w:t>• Ela serve para orientar a rotina operacional.</w:t>
             </w:r>
           </w:p>
           <w:p>
@@ -662,15 +593,7 @@
               <w:spacing w:after="40"/>
             </w:pPr>
             <w:r>
-              <w:t>• Olhe contra o mesmo dia da semana passada.</w:t>
-            </w:r>
-          </w:p>
-          <w:p>
-            <w:pPr>
-              <w:spacing w:after="40"/>
-            </w:pPr>
-            <w:r>
-              <w:t>• Evite comparar Conta 3 com Conta principal sem contexto.</w:t>
+              <w:t>• Seu papel é conferir, executar e sinalizar problemas práticos.</w:t>
             </w:r>
           </w:p>
         </w:tc>
@@ -679,11 +602,11 @@
     <w:p/>
     <w:p>
       <w:pPr>
-        <w:pStyle w:val="Heading2"/>
-        <w:spacing w:before="160" w:after="80"/>
+        <w:pStyle w:val="Heading1"/>
+        <w:spacing w:before="240" w:after="120"/>
       </w:pPr>
       <w:r>
-        <w:t>2.3. Olhar produtos importantes</w:t>
+        <w:t>3. Rotina diária</w:t>
       </w:r>
     </w:p>
     <w:p>
@@ -694,7 +617,193 @@
         <w:rPr>
           <w:b w:val="0"/>
         </w:rPr>
-        <w:t>Priorize os produtos de maior giro.</w:t>
+        <w:t>Faça essa rotina todos os dias úteis, de preferência no começo da manhã.</w:t>
+      </w:r>
+    </w:p>
+    <w:p>
+      <w:pPr>
+        <w:pStyle w:val="Heading2"/>
+        <w:spacing w:before="160" w:after="80"/>
+      </w:pPr>
+      <w:r>
+        <w:t>3.1. Abrir as 3 contas</w:t>
+      </w:r>
+    </w:p>
+    <w:p>
+      <w:pPr>
+        <w:pStyle w:val="ListBullet"/>
+        <w:spacing w:after="60"/>
+        <w:ind w:left="317"/>
+      </w:pPr>
+      <w:r>
+        <w:t>Entrar no Seller Center de cada conta.</w:t>
+      </w:r>
+    </w:p>
+    <w:p>
+      <w:pPr>
+        <w:pStyle w:val="ListBullet"/>
+        <w:spacing w:after="60"/>
+        <w:ind w:left="317"/>
+      </w:pPr>
+      <w:r>
+        <w:t>Conferir pedidos novos.</w:t>
+      </w:r>
+    </w:p>
+    <w:p>
+      <w:pPr>
+        <w:pStyle w:val="ListBullet"/>
+        <w:spacing w:after="60"/>
+        <w:ind w:left="317"/>
+      </w:pPr>
+      <w:r>
+        <w:t>Conferir mensagens de clientes.</w:t>
+      </w:r>
+    </w:p>
+    <w:p>
+      <w:pPr>
+        <w:pStyle w:val="ListBullet"/>
+        <w:spacing w:after="60"/>
+        <w:ind w:left="317"/>
+      </w:pPr>
+      <w:r>
+        <w:t>Conferir notificações da Shopee.</w:t>
+      </w:r>
+    </w:p>
+    <w:p>
+      <w:pPr>
+        <w:pStyle w:val="ListBullet"/>
+        <w:spacing w:after="60"/>
+        <w:ind w:left="317"/>
+      </w:pPr>
+      <w:r>
+        <w:t>Conferir anúncios com alerta, pausa ou reprovação.</w:t>
+      </w:r>
+    </w:p>
+    <w:p>
+      <w:pPr>
+        <w:pStyle w:val="ListBullet"/>
+        <w:spacing w:after="60"/>
+        <w:ind w:left="317"/>
+      </w:pPr>
+      <w:r>
+        <w:t>Conferir produtos sem estoque ou com estoque baixo.</w:t>
+      </w:r>
+    </w:p>
+    <w:p>
+      <w:pPr>
+        <w:pStyle w:val="Heading2"/>
+        <w:spacing w:before="160" w:after="80"/>
+      </w:pPr>
+      <w:r>
+        <w:t>3.2. Conferir pedidos</w:t>
+      </w:r>
+    </w:p>
+    <w:p>
+      <w:pPr>
+        <w:pStyle w:val="ListBullet"/>
+        <w:spacing w:after="60"/>
+        <w:ind w:left="317"/>
+      </w:pPr>
+      <w:r>
+        <w:t>Pedidos novos aguardando ação.</w:t>
+      </w:r>
+    </w:p>
+    <w:p>
+      <w:pPr>
+        <w:pStyle w:val="ListBullet"/>
+        <w:spacing w:after="60"/>
+        <w:ind w:left="317"/>
+      </w:pPr>
+      <w:r>
+        <w:t>Pedidos atrasados ou próximos do prazo.</w:t>
+      </w:r>
+    </w:p>
+    <w:p>
+      <w:pPr>
+        <w:pStyle w:val="ListBullet"/>
+        <w:spacing w:after="60"/>
+        <w:ind w:left="317"/>
+      </w:pPr>
+      <w:r>
+        <w:t>Pedidos cancelados.</w:t>
+      </w:r>
+    </w:p>
+    <w:p>
+      <w:pPr>
+        <w:pStyle w:val="ListBullet"/>
+        <w:spacing w:after="60"/>
+        <w:ind w:left="317"/>
+      </w:pPr>
+      <w:r>
+        <w:t>Pedidos com solicitação de devolução.</w:t>
+      </w:r>
+    </w:p>
+    <w:p>
+      <w:pPr>
+        <w:pStyle w:val="ListBullet"/>
+        <w:spacing w:after="60"/>
+        <w:ind w:left="317"/>
+      </w:pPr>
+      <w:r>
+        <w:t>Pedidos com problema de envio.</w:t>
+      </w:r>
+    </w:p>
+    <w:p>
+      <w:pPr>
+        <w:pStyle w:val="Heading2"/>
+        <w:spacing w:before="160" w:after="80"/>
+      </w:pPr>
+      <w:r>
+        <w:t>3.3. Conferir atendimento</w:t>
+      </w:r>
+    </w:p>
+    <w:p>
+      <w:pPr>
+        <w:pStyle w:val="ListBullet"/>
+        <w:spacing w:after="60"/>
+        <w:ind w:left="317"/>
+      </w:pPr>
+      <w:r>
+        <w:t>Responder mensagens pendentes dentro do prazo.</w:t>
+      </w:r>
+    </w:p>
+    <w:p>
+      <w:pPr>
+        <w:pStyle w:val="ListBullet"/>
+        <w:spacing w:after="60"/>
+        <w:ind w:left="317"/>
+      </w:pPr>
+      <w:r>
+        <w:t>Priorizar cliente com pedido em andamento.</w:t>
+      </w:r>
+    </w:p>
+    <w:p>
+      <w:pPr>
+        <w:pStyle w:val="ListBullet"/>
+        <w:spacing w:after="60"/>
+        <w:ind w:left="317"/>
+      </w:pPr>
+      <w:r>
+        <w:t>Não prometer algo que dependa de estoque, preço ou prazo sem confirmar.</w:t>
+      </w:r>
+    </w:p>
+    <w:p>
+      <w:pPr>
+        <w:pStyle w:val="ListBullet"/>
+        <w:spacing w:after="60"/>
+        <w:ind w:left="317"/>
+      </w:pPr>
+      <w:r>
+        <w:t>Registrar dúvidas recorrentes dos clientes.</w:t>
+      </w:r>
+    </w:p>
+    <w:p>
+      <w:pPr>
+        <w:pStyle w:val="Heading2"/>
+        <w:spacing w:before="160" w:after="80"/>
+      </w:pPr>
+      <w:r>
+        <w:t>3.4. Conferir anúncios importantes</w:t>
       </w:r>
     </w:p>
     <w:p>
@@ -705,7 +814,7 @@
         <w:rPr>
           <w:b w:val="0"/>
         </w:rPr>
-        <w:t>Hoje, os grupos mais sensíveis são:</w:t>
+        <w:t>Olhe primeiro os produtos de maior giro e os produtos citados na análise diária do Pedro.</w:t>
       </w:r>
     </w:p>
     <w:p>
@@ -715,78 +824,7 @@
         <w:ind w:left="317"/>
       </w:pPr>
       <w:r>
-        <w:t>Potes herméticos de vidro.</w:t>
-      </w:r>
-    </w:p>
-    <w:p>
-      <w:pPr>
-        <w:pStyle w:val="ListBullet"/>
-        <w:spacing w:after="60"/>
-        <w:ind w:left="317"/>
-      </w:pPr>
-      <w:r>
-        <w:t>Kits e combos de potes.</w:t>
-      </w:r>
-    </w:p>
-    <w:p>
-      <w:pPr>
-        <w:pStyle w:val="ListBullet"/>
-        <w:spacing w:after="60"/>
-        <w:ind w:left="317"/>
-      </w:pPr>
-      <w:r>
-        <w:t>Itens Budamix de maior volume.</w:t>
-      </w:r>
-    </w:p>
-    <w:p>
-      <w:pPr>
-        <w:pStyle w:val="ListBullet"/>
-        <w:spacing w:after="60"/>
-        <w:ind w:left="317"/>
-      </w:pPr>
-      <w:r>
-        <w:t>Produtos em campanha.</w:t>
-      </w:r>
-    </w:p>
-    <w:p>
-      <w:pPr>
-        <w:pStyle w:val="ListBullet"/>
-        <w:spacing w:after="60"/>
-        <w:ind w:left="317"/>
-      </w:pPr>
-      <w:r>
-        <w:t>Produtos com estoque baixo.</w:t>
-      </w:r>
-    </w:p>
-    <w:p>
-      <w:pPr>
-        <w:spacing w:after="100" w:line="269" w:lineRule="auto"/>
-      </w:pPr>
-      <w:r>
-        <w:rPr>
-          <w:b w:val="0"/>
-        </w:rPr>
-        <w:t>Para cada produto importante, confira:</w:t>
-      </w:r>
-    </w:p>
-    <w:p>
-      <w:pPr>
-        <w:pStyle w:val="ListBullet"/>
-        <w:spacing w:after="60"/>
-        <w:ind w:left="317"/>
-      </w:pPr>
-      <w:r>
-        <w:t>Preço.</w:t>
-      </w:r>
-    </w:p>
-    <w:p>
-      <w:pPr>
-        <w:pStyle w:val="ListBullet"/>
-        <w:spacing w:after="60"/>
-        <w:ind w:left="317"/>
-      </w:pPr>
-      <w:r>
-        <w:t>Estoque.</w:t>
+        <w:t>Anúncio ativo ou pausado.</w:t>
       </w:r>
     </w:p>
     <w:p>
@@ -806,7 +844,7 @@
         <w:ind w:left="317"/>
       </w:pPr>
       <w:r>
-        <w:t>Título e foto principal.</w:t>
+        <w:t>Estoque visível na Shopee.</w:t>
       </w:r>
     </w:p>
     <w:p>
@@ -816,7 +854,7 @@
         <w:ind w:left="317"/>
       </w:pPr>
       <w:r>
-        <w:t>Se o anúncio está ativo.</w:t>
+        <w:t>Foto principal.</w:t>
       </w:r>
     </w:p>
     <w:p>
@@ -826,7 +864,7 @@
         <w:ind w:left="317"/>
       </w:pPr>
       <w:r>
-        <w:t>Se está participando de campanha.</w:t>
+        <w:t>Título.</w:t>
       </w:r>
     </w:p>
     <w:p>
@@ -836,97 +874,27 @@
         <w:ind w:left="317"/>
       </w:pPr>
       <w:r>
-        <w:t>Se está com Ads ou afiliado ativo.</w:t>
+        <w:t>Preço publicado.</w:t>
       </w:r>
     </w:p>
     <w:p>
       <w:pPr>
-        <w:pStyle w:val="Heading2"/>
-        <w:spacing w:before="160" w:after="80"/>
+        <w:pStyle w:val="ListBullet"/>
+        <w:spacing w:after="60"/>
+        <w:ind w:left="317"/>
       </w:pPr>
       <w:r>
-        <w:t>2.4. Conferir anúncios com queda</w:t>
+        <w:t>Participação em campanha.</w:t>
       </w:r>
     </w:p>
     <w:p>
       <w:pPr>
-        <w:spacing w:after="100" w:line="269" w:lineRule="auto"/>
-      </w:pPr>
-      <w:r>
-        <w:rPr>
-          <w:b w:val="0"/>
-        </w:rPr>
-        <w:t>Se um produto caiu muito, investigue antes de mexer.</w:t>
-      </w:r>
-    </w:p>
-    <w:p>
-      <w:pPr>
         <w:pStyle w:val="ListBullet"/>
         <w:spacing w:after="60"/>
         <w:ind w:left="317"/>
       </w:pPr>
       <w:r>
-        <w:t>Caiu só em uma conta ou nas três?</w:t>
-      </w:r>
-    </w:p>
-    <w:p>
-      <w:pPr>
-        <w:pStyle w:val="ListBullet"/>
-        <w:spacing w:after="60"/>
-        <w:ind w:left="317"/>
-      </w:pPr>
-      <w:r>
-        <w:t>Teve ruptura de estoque?</w:t>
-      </w:r>
-    </w:p>
-    <w:p>
-      <w:pPr>
-        <w:pStyle w:val="ListBullet"/>
-        <w:spacing w:after="60"/>
-        <w:ind w:left="317"/>
-      </w:pPr>
-      <w:r>
-        <w:t>Mudou preço?</w:t>
-      </w:r>
-    </w:p>
-    <w:p>
-      <w:pPr>
-        <w:pStyle w:val="ListBullet"/>
-        <w:spacing w:after="60"/>
-        <w:ind w:left="317"/>
-      </w:pPr>
-      <w:r>
-        <w:t>Saiu de campanha?</w:t>
-      </w:r>
-    </w:p>
-    <w:p>
-      <w:pPr>
-        <w:pStyle w:val="ListBullet"/>
-        <w:spacing w:after="60"/>
-        <w:ind w:left="317"/>
-      </w:pPr>
-      <w:r>
-        <w:t>Concorrente baixou preço?</w:t>
-      </w:r>
-    </w:p>
-    <w:p>
-      <w:pPr>
-        <w:pStyle w:val="ListBullet"/>
-        <w:spacing w:after="60"/>
-        <w:ind w:left="317"/>
-      </w:pPr>
-      <w:r>
-        <w:t>Teve aumento de cancelamento?</w:t>
-      </w:r>
-    </w:p>
-    <w:p>
-      <w:pPr>
-        <w:pStyle w:val="ListBullet"/>
-        <w:spacing w:after="60"/>
-        <w:ind w:left="317"/>
-      </w:pPr>
-      <w:r>
-        <w:t>O anúncio perdeu exposição?</w:t>
+        <w:t>Indicação de Ads ou afiliado ativo, se aparecer no painel.</w:t>
       </w:r>
     </w:p>
     <w:tbl>
@@ -958,7 +926,7 @@
               <w:spacing w:after="40"/>
             </w:pPr>
             <w:r>
-              <w:t>• Não abaixe preço só porque um dia foi fraco.</w:t>
+              <w:t>• Não altere preço sozinha.</w:t>
             </w:r>
           </w:p>
           <w:p>
@@ -966,7 +934,7 @@
               <w:spacing w:after="40"/>
             </w:pPr>
             <w:r>
-              <w:t>• Não pause campanha sem entender o motivo.</w:t>
+              <w:t>• Não pause anúncio campeão sem avisar.</w:t>
             </w:r>
           </w:p>
           <w:p>
@@ -974,7 +942,15 @@
               <w:spacing w:after="40"/>
             </w:pPr>
             <w:r>
-              <w:t>• Não altere anúncio campeão sem avisar o responsável.</w:t>
+              <w:t>• Não entre em campanha sem validação.</w:t>
+            </w:r>
+          </w:p>
+          <w:p>
+            <w:pPr>
+              <w:spacing w:after="40"/>
+            </w:pPr>
+            <w:r>
+              <w:t>• Não altere título ou foto principal de produto importante sem alinhar.</w:t>
             </w:r>
           </w:p>
         </w:tc>
@@ -987,7 +963,7 @@
         <w:spacing w:before="240" w:after="120"/>
       </w:pPr>
       <w:r>
-        <w:t>3. Rotina semanal</w:t>
+        <w:t>4. Rotina semanal</w:t>
       </w:r>
     </w:p>
     <w:p>
@@ -998,7 +974,7 @@
         <w:rPr>
           <w:b w:val="0"/>
         </w:rPr>
-        <w:t>Uma vez por semana, faça uma revisão simples das 3 contas.</w:t>
+        <w:t>Uma vez por semana, faça uma revisão operacional simples.</w:t>
       </w:r>
     </w:p>
     <w:p>
@@ -1007,7 +983,7 @@
         <w:spacing w:before="160" w:after="80"/>
       </w:pPr>
       <w:r>
-        <w:t>3.1. Comparar as contas</w:t>
+        <w:t>4.1. Comparar as contas</w:t>
       </w:r>
     </w:p>
     <w:p>
@@ -1017,7 +993,7 @@
         <w:ind w:left="317"/>
       </w:pPr>
       <w:r>
-        <w:t>Qual conta vendeu mais?</w:t>
+        <w:t>Qual conta teve mais pedidos?</w:t>
       </w:r>
     </w:p>
     <w:p>
@@ -1027,7 +1003,7 @@
         <w:ind w:left="317"/>
       </w:pPr>
       <w:r>
-        <w:t>Qual conta cresceu?</w:t>
+        <w:t>Qual conta teve mais problemas?</w:t>
       </w:r>
     </w:p>
     <w:p>
@@ -1037,7 +1013,7 @@
         <w:ind w:left="317"/>
       </w:pPr>
       <w:r>
-        <w:t>Qual conta caiu?</w:t>
+        <w:t>Qual conta teve mais cancelamentos?</w:t>
       </w:r>
     </w:p>
     <w:p>
@@ -1047,7 +1023,7 @@
         <w:ind w:left="317"/>
       </w:pPr>
       <w:r>
-        <w:t>Quais produtos puxaram o resultado?</w:t>
+        <w:t>Quais produtos apareceram mais?</w:t>
       </w:r>
     </w:p>
     <w:p>
@@ -1057,7 +1033,7 @@
         <w:ind w:left="317"/>
       </w:pPr>
       <w:r>
-        <w:t>Quais produtos estão parados?</w:t>
+        <w:t>Quais produtos ficaram parados?</w:t>
       </w:r>
     </w:p>
     <w:p>
@@ -1067,7 +1043,7 @@
         <w:ind w:left="317"/>
       </w:pPr>
       <w:r>
-        <w:t>Qual conta depende demais de poucos produtos?</w:t>
+        <w:t>Qual conta precisa de atenção na semana seguinte?</w:t>
       </w:r>
     </w:p>
     <w:p>
@@ -1076,7 +1052,7 @@
         <w:spacing w:before="160" w:after="80"/>
       </w:pPr>
       <w:r>
-        <w:t>3.2. Revisar estoque</w:t>
+        <w:t>4.2. Revisar estoque operacional</w:t>
       </w:r>
     </w:p>
     <w:p>
@@ -1086,7 +1062,7 @@
         <w:ind w:left="317"/>
       </w:pPr>
       <w:r>
-        <w:t>Separar produtos com alto giro e estoque baixo.</w:t>
+        <w:t>Produtos de alto giro com estoque baixo.</w:t>
       </w:r>
     </w:p>
     <w:p>
@@ -1096,7 +1072,7 @@
         <w:ind w:left="317"/>
       </w:pPr>
       <w:r>
-        <w:t>Separar produtos com estoque parado.</w:t>
+        <w:t>Produtos sem estoque em alguma variação.</w:t>
       </w:r>
     </w:p>
     <w:p>
@@ -1106,7 +1082,7 @@
         <w:ind w:left="317"/>
       </w:pPr>
       <w:r>
-        <w:t>Avisar antes de produto importante romper.</w:t>
+        <w:t>Produtos ativos na Shopee, mas com risco de ruptura.</w:t>
       </w:r>
     </w:p>
     <w:p>
@@ -1116,7 +1092,7 @@
         <w:ind w:left="317"/>
       </w:pPr>
       <w:r>
-        <w:t>Conferir se anúncios ativos ainda têm estoque real.</w:t>
+        <w:t>Produtos parados com muito estoque.</w:t>
       </w:r>
     </w:p>
     <w:p>
@@ -1125,7 +1101,7 @@
         <w:spacing w:before="160" w:after="80"/>
       </w:pPr>
       <w:r>
-        <w:t>3.3. Revisar campanhas</w:t>
+        <w:t>4.3. Revisar campanhas e exposição</w:t>
       </w:r>
     </w:p>
     <w:p>
@@ -1135,7 +1111,7 @@
         <w:ind w:left="317"/>
       </w:pPr>
       <w:r>
-        <w:t>Ver campanhas ativas em cada conta.</w:t>
+        <w:t>Campanhas ativas em cada conta.</w:t>
       </w:r>
     </w:p>
     <w:p>
@@ -1145,7 +1121,7 @@
         <w:ind w:left="317"/>
       </w:pPr>
       <w:r>
-        <w:t>Ver se a campanha trouxe venda ou só custo/desconto.</w:t>
+        <w:t>Produtos em campanha que precisam de estoque.</w:t>
       </w:r>
     </w:p>
     <w:p>
@@ -1155,7 +1131,7 @@
         <w:ind w:left="317"/>
       </w:pPr>
       <w:r>
-        <w:t>Não entrar em campanha com taxa extra sem validar margem.</w:t>
+        <w:t>Produtos importantes fora de campanha.</w:t>
       </w:r>
     </w:p>
     <w:p>
@@ -1165,7 +1141,7 @@
         <w:ind w:left="317"/>
       </w:pPr>
       <w:r>
-        <w:t>Avisar se a campanha afetar todo o catálogo.</w:t>
+        <w:t>Anúncios com queda de visualização ou pedidos, se o painel mostrar.</w:t>
       </w:r>
     </w:p>
     <w:p>
@@ -1174,7 +1150,7 @@
         <w:spacing w:before="240" w:after="120"/>
       </w:pPr>
       <w:r>
-        <w:t>4. Taxas Shopee: o essencial</w:t>
+        <w:t>5. O que observar em cada produto</w:t>
       </w:r>
     </w:p>
     <w:p>
@@ -1185,473 +1161,17 @@
         <w:rPr>
           <w:b w:val="0"/>
         </w:rPr>
-        <w:t>Você não precisa decorar todas as fórmulas agora.</w:t>
+        <w:t>Use esta lista quando for revisar um produto ou anúncio.</w:t>
       </w:r>
     </w:p>
     <w:p>
       <w:pPr>
-        <w:spacing w:after="100" w:line="269" w:lineRule="auto"/>
+        <w:pStyle w:val="ListBullet"/>
+        <w:spacing w:after="60"/>
+        <w:ind w:left="317"/>
       </w:pPr>
       <w:r>
-        <w:rPr>
-          <w:b w:val="0"/>
-        </w:rPr>
-        <w:t>Mas precisa saber onde a Shopee aperta a margem.</w:t>
-      </w:r>
-    </w:p>
-    <w:tbl>
-      <w:tblPr>
-        <w:tblStyle w:val="TableGrid"/>
-        <w:tblW w:type="auto" w:w="0"/>
-        <w:tblLook w:firstColumn="1" w:firstRow="1" w:lastColumn="0" w:lastRow="0" w:noHBand="0" w:noVBand="1" w:val="04A0"/>
-      </w:tblPr>
-      <w:tblGrid>
-        <w:gridCol w:w="2520"/>
-        <w:gridCol w:w="2520"/>
-        <w:gridCol w:w="2520"/>
-        <w:gridCol w:w="2520"/>
-      </w:tblGrid>
-      <w:tr>
-        <w:tc>
-          <w:tcPr>
-            <w:tcW w:type="dxa" w:w="2520"/>
-            <w:shd w:fill="174C4C"/>
-          </w:tcPr>
-          <w:p>
-            <w:r/>
-            <w:r>
-              <w:rPr>
-                <w:b/>
-                <w:color w:val="FFFFFF"/>
-                <w:sz w:val="19"/>
-              </w:rPr>
-              <w:t>Faixa</w:t>
-            </w:r>
-          </w:p>
-        </w:tc>
-        <w:tc>
-          <w:tcPr>
-            <w:tcW w:type="dxa" w:w="2520"/>
-            <w:shd w:fill="174C4C"/>
-          </w:tcPr>
-          <w:p>
-            <w:r/>
-            <w:r>
-              <w:rPr>
-                <w:b/>
-                <w:color w:val="FFFFFF"/>
-                <w:sz w:val="19"/>
-              </w:rPr>
-              <w:t>Preço do item</w:t>
-            </w:r>
-          </w:p>
-        </w:tc>
-        <w:tc>
-          <w:tcPr>
-            <w:tcW w:type="dxa" w:w="2520"/>
-            <w:shd w:fill="174C4C"/>
-          </w:tcPr>
-          <w:p>
-            <w:r/>
-            <w:r>
-              <w:rPr>
-                <w:b/>
-                <w:color w:val="FFFFFF"/>
-                <w:sz w:val="19"/>
-              </w:rPr>
-              <w:t>Comissão CNPJ</w:t>
-            </w:r>
-          </w:p>
-        </w:tc>
-        <w:tc>
-          <w:tcPr>
-            <w:tcW w:type="dxa" w:w="2520"/>
-            <w:shd w:fill="174C4C"/>
-          </w:tcPr>
-          <w:p>
-            <w:r/>
-            <w:r>
-              <w:rPr>
-                <w:b/>
-                <w:color w:val="FFFFFF"/>
-                <w:sz w:val="19"/>
-              </w:rPr>
-              <w:t>Taxa fixa por item</w:t>
-            </w:r>
-          </w:p>
-        </w:tc>
-      </w:tr>
-      <w:tr>
-        <w:tc>
-          <w:tcPr>
-            <w:tcW w:type="dxa" w:w="2520"/>
-          </w:tcPr>
-          <w:p>
-            <w:r/>
-            <w:r>
-              <w:rPr>
-                <w:b w:val="0"/>
-                <w:sz w:val="19"/>
-              </w:rPr>
-              <w:t>1</w:t>
-            </w:r>
-          </w:p>
-        </w:tc>
-        <w:tc>
-          <w:tcPr>
-            <w:tcW w:type="dxa" w:w="2520"/>
-          </w:tcPr>
-          <w:p>
-            <w:r/>
-            <w:r>
-              <w:rPr>
-                <w:b w:val="0"/>
-                <w:sz w:val="19"/>
-              </w:rPr>
-              <w:t>até R$ 7,99</w:t>
-            </w:r>
-          </w:p>
-        </w:tc>
-        <w:tc>
-          <w:tcPr>
-            <w:tcW w:type="dxa" w:w="2520"/>
-          </w:tcPr>
-          <w:p>
-            <w:r/>
-            <w:r>
-              <w:rPr>
-                <w:b w:val="0"/>
-                <w:sz w:val="19"/>
-              </w:rPr>
-              <w:t>50%</w:t>
-            </w:r>
-          </w:p>
-        </w:tc>
-        <w:tc>
-          <w:tcPr>
-            <w:tcW w:type="dxa" w:w="2520"/>
-          </w:tcPr>
-          <w:p>
-            <w:r/>
-            <w:r>
-              <w:rPr>
-                <w:b w:val="0"/>
-                <w:sz w:val="19"/>
-              </w:rPr>
-              <w:t>R$ 0,00</w:t>
-            </w:r>
-          </w:p>
-        </w:tc>
-      </w:tr>
-      <w:tr>
-        <w:tc>
-          <w:tcPr>
-            <w:tcW w:type="dxa" w:w="2520"/>
-          </w:tcPr>
-          <w:p>
-            <w:r/>
-            <w:r>
-              <w:rPr>
-                <w:b w:val="0"/>
-                <w:sz w:val="19"/>
-              </w:rPr>
-              <w:t>2</w:t>
-            </w:r>
-          </w:p>
-        </w:tc>
-        <w:tc>
-          <w:tcPr>
-            <w:tcW w:type="dxa" w:w="2520"/>
-          </w:tcPr>
-          <w:p>
-            <w:r/>
-            <w:r>
-              <w:rPr>
-                <w:b w:val="0"/>
-                <w:sz w:val="19"/>
-              </w:rPr>
-              <w:t>R$ 8,00 a R$ 79,99</w:t>
-            </w:r>
-          </w:p>
-        </w:tc>
-        <w:tc>
-          <w:tcPr>
-            <w:tcW w:type="dxa" w:w="2520"/>
-          </w:tcPr>
-          <w:p>
-            <w:r/>
-            <w:r>
-              <w:rPr>
-                <w:b w:val="0"/>
-                <w:sz w:val="19"/>
-              </w:rPr>
-              <w:t>20%</w:t>
-            </w:r>
-          </w:p>
-        </w:tc>
-        <w:tc>
-          <w:tcPr>
-            <w:tcW w:type="dxa" w:w="2520"/>
-          </w:tcPr>
-          <w:p>
-            <w:r/>
-            <w:r>
-              <w:rPr>
-                <w:b w:val="0"/>
-                <w:sz w:val="19"/>
-              </w:rPr>
-              <w:t>R$ 4,00</w:t>
-            </w:r>
-          </w:p>
-        </w:tc>
-      </w:tr>
-      <w:tr>
-        <w:tc>
-          <w:tcPr>
-            <w:tcW w:type="dxa" w:w="2520"/>
-          </w:tcPr>
-          <w:p>
-            <w:r/>
-            <w:r>
-              <w:rPr>
-                <w:b w:val="0"/>
-                <w:sz w:val="19"/>
-              </w:rPr>
-              <w:t>3</w:t>
-            </w:r>
-          </w:p>
-        </w:tc>
-        <w:tc>
-          <w:tcPr>
-            <w:tcW w:type="dxa" w:w="2520"/>
-          </w:tcPr>
-          <w:p>
-            <w:r/>
-            <w:r>
-              <w:rPr>
-                <w:b w:val="0"/>
-                <w:sz w:val="19"/>
-              </w:rPr>
-              <w:t>R$ 80,00 a R$ 99,99</w:t>
-            </w:r>
-          </w:p>
-        </w:tc>
-        <w:tc>
-          <w:tcPr>
-            <w:tcW w:type="dxa" w:w="2520"/>
-          </w:tcPr>
-          <w:p>
-            <w:r/>
-            <w:r>
-              <w:rPr>
-                <w:b w:val="0"/>
-                <w:sz w:val="19"/>
-              </w:rPr>
-              <w:t>14%</w:t>
-            </w:r>
-          </w:p>
-        </w:tc>
-        <w:tc>
-          <w:tcPr>
-            <w:tcW w:type="dxa" w:w="2520"/>
-          </w:tcPr>
-          <w:p>
-            <w:r/>
-            <w:r>
-              <w:rPr>
-                <w:b w:val="0"/>
-                <w:sz w:val="19"/>
-              </w:rPr>
-              <w:t>R$ 16,00</w:t>
-            </w:r>
-          </w:p>
-        </w:tc>
-      </w:tr>
-      <w:tr>
-        <w:tc>
-          <w:tcPr>
-            <w:tcW w:type="dxa" w:w="2520"/>
-          </w:tcPr>
-          <w:p>
-            <w:r/>
-            <w:r>
-              <w:rPr>
-                <w:b w:val="0"/>
-                <w:sz w:val="19"/>
-              </w:rPr>
-              <w:t>4</w:t>
-            </w:r>
-          </w:p>
-        </w:tc>
-        <w:tc>
-          <w:tcPr>
-            <w:tcW w:type="dxa" w:w="2520"/>
-          </w:tcPr>
-          <w:p>
-            <w:r/>
-            <w:r>
-              <w:rPr>
-                <w:b w:val="0"/>
-                <w:sz w:val="19"/>
-              </w:rPr>
-              <w:t>R$ 100,00 a R$ 199,99</w:t>
-            </w:r>
-          </w:p>
-        </w:tc>
-        <w:tc>
-          <w:tcPr>
-            <w:tcW w:type="dxa" w:w="2520"/>
-          </w:tcPr>
-          <w:p>
-            <w:r/>
-            <w:r>
-              <w:rPr>
-                <w:b w:val="0"/>
-                <w:sz w:val="19"/>
-              </w:rPr>
-              <w:t>14%</w:t>
-            </w:r>
-          </w:p>
-        </w:tc>
-        <w:tc>
-          <w:tcPr>
-            <w:tcW w:type="dxa" w:w="2520"/>
-          </w:tcPr>
-          <w:p>
-            <w:r/>
-            <w:r>
-              <w:rPr>
-                <w:b w:val="0"/>
-                <w:sz w:val="19"/>
-              </w:rPr>
-              <w:t>R$ 20,00</w:t>
-            </w:r>
-          </w:p>
-        </w:tc>
-      </w:tr>
-      <w:tr>
-        <w:tc>
-          <w:tcPr>
-            <w:tcW w:type="dxa" w:w="2520"/>
-          </w:tcPr>
-          <w:p>
-            <w:r/>
-            <w:r>
-              <w:rPr>
-                <w:b w:val="0"/>
-                <w:sz w:val="19"/>
-              </w:rPr>
-              <w:t>5</w:t>
-            </w:r>
-          </w:p>
-        </w:tc>
-        <w:tc>
-          <w:tcPr>
-            <w:tcW w:type="dxa" w:w="2520"/>
-          </w:tcPr>
-          <w:p>
-            <w:r/>
-            <w:r>
-              <w:rPr>
-                <w:b w:val="0"/>
-                <w:sz w:val="19"/>
-              </w:rPr>
-              <w:t>R$ 200,00 ou mais</w:t>
-            </w:r>
-          </w:p>
-        </w:tc>
-        <w:tc>
-          <w:tcPr>
-            <w:tcW w:type="dxa" w:w="2520"/>
-          </w:tcPr>
-          <w:p>
-            <w:r/>
-            <w:r>
-              <w:rPr>
-                <w:b w:val="0"/>
-                <w:sz w:val="19"/>
-              </w:rPr>
-              <w:t>14%</w:t>
-            </w:r>
-          </w:p>
-        </w:tc>
-        <w:tc>
-          <w:tcPr>
-            <w:tcW w:type="dxa" w:w="2520"/>
-          </w:tcPr>
-          <w:p>
-            <w:r/>
-            <w:r>
-              <w:rPr>
-                <w:b w:val="0"/>
-                <w:sz w:val="19"/>
-              </w:rPr>
-              <w:t>R$ 26,00</w:t>
-            </w:r>
-          </w:p>
-        </w:tc>
-      </w:tr>
-    </w:tbl>
-    <w:p/>
-    <w:tbl>
-      <w:tblPr>
-        <w:tblW w:type="auto" w:w="0"/>
-        <w:tblLook w:firstColumn="1" w:firstRow="1" w:lastColumn="0" w:lastRow="0" w:noHBand="0" w:noVBand="1" w:val="04A0"/>
-      </w:tblPr>
-      <w:tblGrid>
-        <w:gridCol w:w="10080"/>
-      </w:tblGrid>
-      <w:tr>
-        <w:tc>
-          <w:tcPr>
-            <w:tcW w:type="dxa" w:w="10080"/>
-            <w:shd w:fill="FFF7E6"/>
-          </w:tcPr>
-          <w:p>
-            <w:r>
-              <w:rPr>
-                <w:b/>
-                <w:color w:val="174C4C"/>
-                <w:sz w:val="21"/>
-              </w:rPr>
-              <w:t>Ponto crítico de preço</w:t>
-            </w:r>
-          </w:p>
-          <w:p>
-            <w:pPr>
-              <w:spacing w:after="40"/>
-            </w:pPr>
-            <w:r>
-              <w:t>• R$ 79,99 costuma ser muito melhor que R$ 80,00.</w:t>
-            </w:r>
-          </w:p>
-          <w:p>
-            <w:pPr>
-              <w:spacing w:after="40"/>
-            </w:pPr>
-            <w:r>
-              <w:t>• Ao passar de R$ 79,99 para R$ 80,00, a taxa fixa salta de R$ 4 para R$ 16.</w:t>
-            </w:r>
-          </w:p>
-          <w:p>
-            <w:pPr>
-              <w:spacing w:after="40"/>
-            </w:pPr>
-            <w:r>
-              <w:t>• Antes de mudar preço perto de R$ 80, R$ 100 ou R$ 200, peça validação.</w:t>
-            </w:r>
-          </w:p>
-        </w:tc>
-      </w:tr>
-    </w:tbl>
-    <w:p/>
-    <w:p>
-      <w:pPr>
-        <w:pStyle w:val="Heading2"/>
-        <w:spacing w:before="160" w:after="80"/>
-      </w:pPr>
-      <w:r>
-        <w:t>4.1. O que entra na margem</w:t>
+        <w:t>Produto está ativo?</w:t>
       </w:r>
     </w:p>
     <w:p>
@@ -1661,7 +1181,7 @@
         <w:ind w:left="317"/>
       </w:pPr>
       <w:r>
-        <w:t>Comissão da Shopee.</w:t>
+        <w:t>Todas as variações corretas estão ativas?</w:t>
       </w:r>
     </w:p>
     <w:p>
@@ -1671,7 +1191,7 @@
         <w:ind w:left="317"/>
       </w:pPr>
       <w:r>
-        <w:t>Taxa fixa por item.</w:t>
+        <w:t>Tem estoque suficiente?</w:t>
       </w:r>
     </w:p>
     <w:p>
@@ -1681,7 +1201,7 @@
         <w:ind w:left="317"/>
       </w:pPr>
       <w:r>
-        <w:t>Custo do produto.</w:t>
+        <w:t>A foto principal está boa?</w:t>
       </w:r>
     </w:p>
     <w:p>
@@ -1691,7 +1211,7 @@
         <w:ind w:left="317"/>
       </w:pPr>
       <w:r>
-        <w:t>Embalagem.</w:t>
+        <w:t>O título está claro?</w:t>
       </w:r>
     </w:p>
     <w:p>
@@ -1701,7 +1221,7 @@
         <w:ind w:left="317"/>
       </w:pPr>
       <w:r>
-        <w:t>Desconto ou cupom bancado pela loja.</w:t>
+        <w:t>O preço está diferente do esperado?</w:t>
       </w:r>
     </w:p>
     <w:p>
@@ -1711,7 +1231,7 @@
         <w:ind w:left="317"/>
       </w:pPr>
       <w:r>
-        <w:t>Ads.</w:t>
+        <w:t>Tem campanha ativa?</w:t>
       </w:r>
     </w:p>
     <w:p>
@@ -1721,7 +1241,7 @@
         <w:ind w:left="317"/>
       </w:pPr>
       <w:r>
-        <w:t>Afiliados, se estiver ativo.</w:t>
+        <w:t>Tem reclamação ou pergunta recorrente?</w:t>
       </w:r>
     </w:p>
     <w:p>
@@ -1731,127 +1251,7 @@
         <w:ind w:left="317"/>
       </w:pPr>
       <w:r>
-        <w:t>Devoluções e avarias.</w:t>
-      </w:r>
-    </w:p>
-    <w:p>
-      <w:pPr>
-        <w:pStyle w:val="Heading2"/>
-        <w:spacing w:before="160" w:after="80"/>
-      </w:pPr>
-      <w:r>
-        <w:t>4.2. O que não deve confundir</w:t>
-      </w:r>
-    </w:p>
-    <w:p>
-      <w:pPr>
-        <w:pStyle w:val="ListBullet"/>
-        <w:spacing w:after="60"/>
-        <w:ind w:left="317"/>
-      </w:pPr>
-      <w:r>
-        <w:t>O desconto PIX é bancado pela Shopee. Em regra, não reduz o que a Budamix recebe.</w:t>
-      </w:r>
-    </w:p>
-    <w:p>
-      <w:pPr>
-        <w:pStyle w:val="ListBullet"/>
-        <w:spacing w:after="60"/>
-        <w:ind w:left="317"/>
-      </w:pPr>
-      <w:r>
-        <w:t>Frete grátis tem subsídio da Shopee, mas pode sobrar custo em produto pesado ou destino caro.</w:t>
-      </w:r>
-    </w:p>
-    <w:p>
-      <w:pPr>
-        <w:pStyle w:val="ListBullet"/>
-        <w:spacing w:after="60"/>
-        <w:ind w:left="317"/>
-      </w:pPr>
-      <w:r>
-        <w:t>Campanha de destaque pode cobrar taxa extra sobre vendas do período.</w:t>
-      </w:r>
-    </w:p>
-    <w:p>
-      <w:pPr>
-        <w:pStyle w:val="ListBullet"/>
-        <w:spacing w:after="60"/>
-        <w:ind w:left="317"/>
-      </w:pPr>
-      <w:r>
-        <w:t>Ads e afiliados são custos adicionais. Não olhe só faturamento.</w:t>
-      </w:r>
-    </w:p>
-    <w:p>
-      <w:pPr>
-        <w:pStyle w:val="Heading1"/>
-        <w:spacing w:before="240" w:after="120"/>
-      </w:pPr>
-      <w:r>
-        <w:t>5. Shopee Full e envio normal</w:t>
-      </w:r>
-    </w:p>
-    <w:p>
-      <w:pPr>
-        <w:spacing w:after="100" w:line="269" w:lineRule="auto"/>
-      </w:pPr>
-      <w:r>
-        <w:rPr>
-          <w:b w:val="0"/>
-        </w:rPr>
-        <w:t>Alguns produtos podem vender via Shopee Full.</w:t>
-      </w:r>
-    </w:p>
-    <w:p>
-      <w:pPr>
-        <w:spacing w:after="100" w:line="269" w:lineRule="auto"/>
-      </w:pPr>
-      <w:r>
-        <w:rPr>
-          <w:b w:val="0"/>
-        </w:rPr>
-        <w:t>Isso muda a operação e pode mudar a margem efetiva.</w:t>
-      </w:r>
-    </w:p>
-    <w:p>
-      <w:pPr>
-        <w:pStyle w:val="ListBullet"/>
-        <w:spacing w:after="60"/>
-        <w:ind w:left="317"/>
-      </w:pPr>
-      <w:r>
-        <w:t>Acompanhe quantos pedidos de cada conta saem via Full.</w:t>
-      </w:r>
-    </w:p>
-    <w:p>
-      <w:pPr>
-        <w:pStyle w:val="ListBullet"/>
-        <w:spacing w:after="60"/>
-        <w:ind w:left="317"/>
-      </w:pPr>
-      <w:r>
-        <w:t>Produtos Full podem ter benefício no programa Full+ se a conta bater participação mínima no mês.</w:t>
-      </w:r>
-    </w:p>
-    <w:p>
-      <w:pPr>
-        <w:pStyle w:val="ListBullet"/>
-        <w:spacing w:after="60"/>
-        <w:ind w:left="317"/>
-      </w:pPr>
-      <w:r>
-        <w:t>O benefício aparece depois, como devolução de comissão na carteira Shopee.</w:t>
-      </w:r>
-    </w:p>
-    <w:p>
-      <w:pPr>
-        <w:pStyle w:val="ListBullet"/>
-        <w:spacing w:after="60"/>
-        <w:ind w:left="317"/>
-      </w:pPr>
-      <w:r>
-        <w:t>Não use Full+ para explicar venda do dia. Use como contexto de margem e logística.</w:t>
+        <w:t>Tem devolução ou cancelamento acima do normal?</w:t>
       </w:r>
     </w:p>
     <w:tbl>
@@ -1875,7 +1275,7 @@
                 <w:color w:val="174C4C"/>
                 <w:sz w:val="21"/>
               </w:rPr>
-              <w:t>Quando avisar</w:t>
+              <w:t>Se encontrar problema</w:t>
             </w:r>
           </w:p>
           <w:p>
@@ -1883,7 +1283,7 @@
               <w:spacing w:after="40"/>
             </w:pPr>
             <w:r>
-              <w:t>• Produto importante sem estoque no Full.</w:t>
+              <w:t>• Tire print.</w:t>
             </w:r>
           </w:p>
           <w:p>
@@ -1891,7 +1291,7 @@
               <w:spacing w:after="40"/>
             </w:pPr>
             <w:r>
-              <w:t>• Conta com queda forte de participação Full.</w:t>
+              <w:t>• Anote a conta.</w:t>
             </w:r>
           </w:p>
           <w:p>
@@ -1899,7 +1299,7 @@
               <w:spacing w:after="40"/>
             </w:pPr>
             <w:r>
-              <w:t>• Produto de alto giro vendendo bem, mas sem reposição planejada.</w:t>
+              <w:t>• Anote o produto/SKU.</w:t>
             </w:r>
           </w:p>
           <w:p>
@@ -1907,7 +1307,15 @@
               <w:spacing w:after="40"/>
             </w:pPr>
             <w:r>
-              <w:t>• Produto Full com preço ou margem apertada.</w:t>
+              <w:t>• Explique em uma frase o que aconteceu.</w:t>
+            </w:r>
+          </w:p>
+          <w:p>
+            <w:pPr>
+              <w:spacing w:after="40"/>
+            </w:pPr>
+            <w:r>
+              <w:t>• Envie para validação antes de alterar algo sensível.</w:t>
             </w:r>
           </w:p>
         </w:tc>
@@ -1920,7 +1328,7 @@
         <w:spacing w:before="240" w:after="120"/>
       </w:pPr>
       <w:r>
-        <w:t>6. Fechamento mensal</w:t>
+        <w:t>6. Shopee Full e envio normal</w:t>
       </w:r>
     </w:p>
     <w:p>
@@ -1931,16 +1339,7 @@
         <w:rPr>
           <w:b w:val="0"/>
         </w:rPr>
-        <w:t>No fechamento, o objetivo é saber quanto vendeu, quanto ficou líquido e quanto foi consumido por taxas.</w:t>
-      </w:r>
-    </w:p>
-    <w:p>
-      <w:pPr>
-        <w:pStyle w:val="Heading2"/>
-        <w:spacing w:before="160" w:after="80"/>
-      </w:pPr>
-      <w:r>
-        <w:t>6.1. Separar por conta</w:t>
+        <w:t>Alguns produtos podem vender via Shopee Full. Outros saem por envio normal.</w:t>
       </w:r>
     </w:p>
     <w:p>
@@ -1951,7 +1350,7 @@
         <w:rPr>
           <w:b w:val="0"/>
         </w:rPr>
-        <w:t>O fechamento da Shopee sempre deve mostrar as 3 contas separadas.</w:t>
+        <w:t>No dia a dia, sua função é perceber problemas operacionais.</w:t>
       </w:r>
     </w:p>
     <w:p>
@@ -1961,7 +1360,7 @@
         <w:ind w:left="317"/>
       </w:pPr>
       <w:r>
-        <w:t>Budamix Store / budamix.store.</w:t>
+        <w:t>Produto importante sem estoque no Full.</w:t>
       </w:r>
     </w:p>
     <w:p>
@@ -1971,7 +1370,7 @@
         <w:ind w:left="317"/>
       </w:pPr>
       <w:r>
-        <w:t>Budamix Oficial / budamix_store.</w:t>
+        <w:t>Produto vendendo bem, mas sem reposição planejada.</w:t>
       </w:r>
     </w:p>
     <w:p>
@@ -1981,7 +1380,7 @@
         <w:ind w:left="317"/>
       </w:pPr>
       <w:r>
-        <w:t>Budamix Shop / budamix.shop.</w:t>
+        <w:t>Conta com muitos pedidos fora do padrão normal.</w:t>
       </w:r>
     </w:p>
     <w:p>
@@ -1991,254 +1390,17 @@
         <w:ind w:left="317"/>
       </w:pPr>
       <w:r>
-        <w:t>Depois disso, pode ter um total consolidado.</w:t>
+        <w:t>Pedido com atraso ou problema de envio.</w:t>
       </w:r>
     </w:p>
     <w:p>
       <w:pPr>
-        <w:pStyle w:val="Heading2"/>
-        <w:spacing w:before="160" w:after="80"/>
-      </w:pPr>
-      <w:r>
-        <w:t>6.2. Conferir os principais números</w:t>
-      </w:r>
-    </w:p>
-    <w:p>
-      <w:pPr>
         <w:pStyle w:val="ListBullet"/>
         <w:spacing w:after="60"/>
         <w:ind w:left="317"/>
       </w:pPr>
       <w:r>
-        <w:t>Faturamento bruto comercial.</w:t>
-      </w:r>
-    </w:p>
-    <w:p>
-      <w:pPr>
-        <w:pStyle w:val="ListBullet"/>
-        <w:spacing w:after="60"/>
-        <w:ind w:left="317"/>
-      </w:pPr>
-      <w:r>
-        <w:t>Pedidos válidos.</w:t>
-      </w:r>
-    </w:p>
-    <w:p>
-      <w:pPr>
-        <w:pStyle w:val="ListBullet"/>
-        <w:spacing w:after="60"/>
-        <w:ind w:left="317"/>
-      </w:pPr>
-      <w:r>
-        <w:t>Cancelamentos e devoluções.</w:t>
-      </w:r>
-    </w:p>
-    <w:p>
-      <w:pPr>
-        <w:pStyle w:val="ListBullet"/>
-        <w:spacing w:after="60"/>
-        <w:ind w:left="317"/>
-      </w:pPr>
-      <w:r>
-        <w:t>Receita líquida ou valor recebido.</w:t>
-      </w:r>
-    </w:p>
-    <w:p>
-      <w:pPr>
-        <w:pStyle w:val="ListBullet"/>
-        <w:spacing w:after="60"/>
-        <w:ind w:left="317"/>
-      </w:pPr>
-      <w:r>
-        <w:t>Comissão Shopee.</w:t>
-      </w:r>
-    </w:p>
-    <w:p>
-      <w:pPr>
-        <w:pStyle w:val="ListBullet"/>
-        <w:spacing w:after="60"/>
-        <w:ind w:left="317"/>
-      </w:pPr>
-      <w:r>
-        <w:t>Taxas fixas.</w:t>
-      </w:r>
-    </w:p>
-    <w:p>
-      <w:pPr>
-        <w:pStyle w:val="ListBullet"/>
-        <w:spacing w:after="60"/>
-        <w:ind w:left="317"/>
-      </w:pPr>
-      <w:r>
-        <w:t>Taxas de campanha, se existirem.</w:t>
-      </w:r>
-    </w:p>
-    <w:p>
-      <w:pPr>
-        <w:pStyle w:val="ListBullet"/>
-        <w:spacing w:after="60"/>
-        <w:ind w:left="317"/>
-      </w:pPr>
-      <w:r>
-        <w:t>Ads e afiliados, se existirem.</w:t>
-      </w:r>
-    </w:p>
-    <w:p>
-      <w:pPr>
-        <w:pStyle w:val="ListBullet"/>
-        <w:spacing w:after="60"/>
-        <w:ind w:left="317"/>
-      </w:pPr>
-      <w:r>
-        <w:t>Top produtos por volume e faturamento.</w:t>
-      </w:r>
-    </w:p>
-    <w:p>
-      <w:pPr>
-        <w:pStyle w:val="Heading2"/>
-        <w:spacing w:before="160" w:after="80"/>
-      </w:pPr>
-      <w:r>
-        <w:t>6.3. Não misturar conceitos</w:t>
-      </w:r>
-    </w:p>
-    <w:tbl>
-      <w:tblPr>
-        <w:tblW w:type="auto" w:w="0"/>
-        <w:tblLook w:firstColumn="1" w:firstRow="1" w:lastColumn="0" w:lastRow="0" w:noHBand="0" w:noVBand="1" w:val="04A0"/>
-      </w:tblPr>
-      <w:tblGrid>
-        <w:gridCol w:w="10080"/>
-      </w:tblGrid>
-      <w:tr>
-        <w:tc>
-          <w:tcPr>
-            <w:tcW w:type="dxa" w:w="10080"/>
-            <w:shd w:fill="FDECEC"/>
-          </w:tcPr>
-          <w:p>
-            <w:r>
-              <w:rPr>
-                <w:b/>
-                <w:color w:val="174C4C"/>
-                <w:sz w:val="21"/>
-              </w:rPr>
-              <w:t>Regra de fechamento</w:t>
-            </w:r>
-          </w:p>
-          <w:p>
-            <w:pPr>
-              <w:spacing w:after="40"/>
-            </w:pPr>
-            <w:r>
-              <w:t>• Faturamento bruto é venda feita.</w:t>
-            </w:r>
-          </w:p>
-          <w:p>
-            <w:pPr>
-              <w:spacing w:after="40"/>
-            </w:pPr>
-            <w:r>
-              <w:t>• Valor liquidado é dinheiro liberado/recebido no extrato.</w:t>
-            </w:r>
-          </w:p>
-          <w:p>
-            <w:pPr>
-              <w:spacing w:after="40"/>
-            </w:pPr>
-            <w:r>
-              <w:t>• Esses dois números podem ser diferentes.</w:t>
-            </w:r>
-          </w:p>
-          <w:p>
-            <w:pPr>
-              <w:spacing w:after="40"/>
-            </w:pPr>
-            <w:r>
-              <w:t>• Não chame valor liquidado de faturamento bruto.</w:t>
-            </w:r>
-          </w:p>
-        </w:tc>
-      </w:tr>
-    </w:tbl>
-    <w:p/>
-    <w:p>
-      <w:pPr>
-        <w:pStyle w:val="Heading2"/>
-        <w:spacing w:before="160" w:after="80"/>
-      </w:pPr>
-      <w:r>
-        <w:t>6.4. Checklist antes de entregar fechamento</w:t>
-      </w:r>
-    </w:p>
-    <w:p>
-      <w:pPr>
-        <w:pStyle w:val="ListBullet"/>
-        <w:spacing w:after="60"/>
-        <w:ind w:left="317"/>
-      </w:pPr>
-      <w:r>
-        <w:t>As 3 contas foram conferidas?</w:t>
-      </w:r>
-    </w:p>
-    <w:p>
-      <w:pPr>
-        <w:pStyle w:val="ListBullet"/>
-        <w:spacing w:after="60"/>
-        <w:ind w:left="317"/>
-      </w:pPr>
-      <w:r>
-        <w:t>O período está correto, do primeiro ao último dia do mês?</w:t>
-      </w:r>
-    </w:p>
-    <w:p>
-      <w:pPr>
-        <w:pStyle w:val="ListBullet"/>
-        <w:spacing w:after="60"/>
-        <w:ind w:left="317"/>
-      </w:pPr>
-      <w:r>
-        <w:t>Cancelamentos e devoluções foram separados?</w:t>
-      </w:r>
-    </w:p>
-    <w:p>
-      <w:pPr>
-        <w:pStyle w:val="ListBullet"/>
-        <w:spacing w:after="60"/>
-        <w:ind w:left="317"/>
-      </w:pPr>
-      <w:r>
-        <w:t>Taxas estão visíveis?</w:t>
-      </w:r>
-    </w:p>
-    <w:p>
-      <w:pPr>
-        <w:pStyle w:val="ListBullet"/>
-        <w:spacing w:after="60"/>
-        <w:ind w:left="317"/>
-      </w:pPr>
-      <w:r>
-        <w:t>Top produtos estão identificados?</w:t>
-      </w:r>
-    </w:p>
-    <w:p>
-      <w:pPr>
-        <w:pStyle w:val="ListBullet"/>
-        <w:spacing w:after="60"/>
-        <w:ind w:left="317"/>
-      </w:pPr>
-      <w:r>
-        <w:t>O total consolidado bate com a soma das contas?</w:t>
-      </w:r>
-    </w:p>
-    <w:p>
-      <w:pPr>
-        <w:pStyle w:val="ListBullet"/>
-        <w:spacing w:after="60"/>
-        <w:ind w:left="317"/>
-      </w:pPr>
-      <w:r>
-        <w:t>Alguma conta ficou com dado incompleto?</w:t>
+        <w:t>Divergência entre estoque real e estoque anunciado.</w:t>
       </w:r>
     </w:p>
     <w:p>
@@ -2287,7 +1449,7 @@
         <w:ind w:left="317"/>
       </w:pPr>
       <w:r>
-        <w:t>Uma conta cair forte sem explicação clara.</w:t>
+        <w:t>Uma conta cair forte e a análise diária apontar atenção.</w:t>
       </w:r>
     </w:p>
     <w:p>
@@ -2297,7 +1459,7 @@
         <w:ind w:left="317"/>
       </w:pPr>
       <w:r>
-        <w:t>Duas ou três contas caírem no mesmo dia.</w:t>
+        <w:t>Duas ou três contas tiverem problema ao mesmo tempo.</w:t>
       </w:r>
     </w:p>
     <w:p>
@@ -2317,7 +1479,7 @@
         <w:ind w:left="317"/>
       </w:pPr>
       <w:r>
-        <w:t>Preço estiver perto de R$ 80, R$ 100 ou R$ 200 e precisar alteração.</w:t>
+        <w:t>Preço publicado parecer errado.</w:t>
       </w:r>
     </w:p>
     <w:p>
@@ -2327,27 +1489,7 @@
         <w:ind w:left="317"/>
       </w:pPr>
       <w:r>
-        <w:t>Campanha cobrar taxa extra sobre todo o catálogo.</w:t>
-      </w:r>
-    </w:p>
-    <w:p>
-      <w:pPr>
-        <w:pStyle w:val="ListBullet"/>
-        <w:spacing w:after="60"/>
-        <w:ind w:left="317"/>
-      </w:pPr>
-      <w:r>
-        <w:t>Ads ou afiliado estiver consumindo margem.</w:t>
-      </w:r>
-    </w:p>
-    <w:p>
-      <w:pPr>
-        <w:pStyle w:val="ListBullet"/>
-        <w:spacing w:after="60"/>
-        <w:ind w:left="317"/>
-      </w:pPr>
-      <w:r>
-        <w:t>Pedido, repasse ou extrato parecer inconsistente.</w:t>
+        <w:t>Campanha nova pedir entrada ou aprovação.</w:t>
       </w:r>
     </w:p>
     <w:p>
@@ -2362,6 +1504,26 @@
     </w:p>
     <w:p>
       <w:pPr>
+        <w:pStyle w:val="ListBullet"/>
+        <w:spacing w:after="60"/>
+        <w:ind w:left="317"/>
+      </w:pPr>
+      <w:r>
+        <w:t>Pedido importante estiver atrasado ou com problema.</w:t>
+      </w:r>
+    </w:p>
+    <w:p>
+      <w:pPr>
+        <w:pStyle w:val="ListBullet"/>
+        <w:spacing w:after="60"/>
+        <w:ind w:left="317"/>
+      </w:pPr>
+      <w:r>
+        <w:t>A Shopee mostrar aviso de penalidade, restrição ou risco para a loja.</w:t>
+      </w:r>
+    </w:p>
+    <w:p>
+      <w:pPr>
         <w:pStyle w:val="Heading2"/>
         <w:spacing w:before="160" w:after="80"/>
       </w:pPr>
@@ -2376,7 +1538,7 @@
         <w:ind w:left="317"/>
       </w:pPr>
       <w:r>
-        <w:t>Registrar números diários.</w:t>
+        <w:t>Registrar números operacionais.</w:t>
       </w:r>
     </w:p>
     <w:p>
@@ -2396,7 +1558,7 @@
         <w:ind w:left="317"/>
       </w:pPr>
       <w:r>
-        <w:t>Montar lista de anúncios com queda.</w:t>
+        <w:t>Montar lista de anúncios com problema.</w:t>
       </w:r>
     </w:p>
     <w:p>
@@ -2416,7 +1578,7 @@
         <w:ind w:left="317"/>
       </w:pPr>
       <w:r>
-        <w:t>Preparar comparativo semanal.</w:t>
+        <w:t>Preparar resumo semanal.</w:t>
       </w:r>
     </w:p>
     <w:p>
@@ -2425,7 +1587,7 @@
         <w:spacing w:before="240" w:after="120"/>
       </w:pPr>
       <w:r>
-        <w:t>8. Modelo de resumo diário</w:t>
+        <w:t>8. Modelo de resumo operacional diário</w:t>
       </w:r>
     </w:p>
     <w:p>
@@ -2436,7 +1598,7 @@
         <w:rPr>
           <w:b w:val="0"/>
         </w:rPr>
-        <w:t>Use este formato para reportar o dia de forma simples.</w:t>
+        <w:t>Use este formato para devolver o acompanhamento do dia.</w:t>
       </w:r>
     </w:p>
     <w:tbl>
@@ -2500,7 +1662,7 @@
                 <w:rFonts w:ascii="Aptos Mono" w:hAnsi="Aptos Mono"/>
                 <w:sz w:val="18"/>
               </w:rPr>
-              <w:t>- Faturamento: R$ ___</w:t>
+              <w:t>- Pedidos pendentes: ___</w:t>
             </w:r>
           </w:p>
           <w:p>
@@ -2512,7 +1674,7 @@
                 <w:rFonts w:ascii="Aptos Mono" w:hAnsi="Aptos Mono"/>
                 <w:sz w:val="18"/>
               </w:rPr>
-              <w:t>- Pedidos: ___</w:t>
+              <w:t>- Mensagens pendentes: ___</w:t>
             </w:r>
           </w:p>
           <w:p>
@@ -2524,7 +1686,7 @@
                 <w:rFonts w:ascii="Aptos Mono" w:hAnsi="Aptos Mono"/>
                 <w:sz w:val="18"/>
               </w:rPr>
-              <w:t>- Produto destaque: ___</w:t>
+              <w:t>- Produtos/anúncios com atenção: ___</w:t>
             </w:r>
           </w:p>
           <w:p>
@@ -2536,7 +1698,7 @@
                 <w:rFonts w:ascii="Aptos Mono" w:hAnsi="Aptos Mono"/>
                 <w:sz w:val="18"/>
               </w:rPr>
-              <w:t>- Atenção: ___</w:t>
+              <w:t>- Ação feita ou necessária: ___</w:t>
             </w:r>
           </w:p>
           <w:p>
@@ -2571,7 +1733,7 @@
                 <w:rFonts w:ascii="Aptos Mono" w:hAnsi="Aptos Mono"/>
                 <w:sz w:val="18"/>
               </w:rPr>
-              <w:t>- Faturamento: R$ ___</w:t>
+              <w:t>- Pedidos pendentes: ___</w:t>
             </w:r>
           </w:p>
           <w:p>
@@ -2583,7 +1745,7 @@
                 <w:rFonts w:ascii="Aptos Mono" w:hAnsi="Aptos Mono"/>
                 <w:sz w:val="18"/>
               </w:rPr>
-              <w:t>- Pedidos: ___</w:t>
+              <w:t>- Mensagens pendentes: ___</w:t>
             </w:r>
           </w:p>
           <w:p>
@@ -2595,7 +1757,7 @@
                 <w:rFonts w:ascii="Aptos Mono" w:hAnsi="Aptos Mono"/>
                 <w:sz w:val="18"/>
               </w:rPr>
-              <w:t>- Produto destaque: ___</w:t>
+              <w:t>- Produtos/anúncios com atenção: ___</w:t>
             </w:r>
           </w:p>
           <w:p>
@@ -2607,7 +1769,7 @@
                 <w:rFonts w:ascii="Aptos Mono" w:hAnsi="Aptos Mono"/>
                 <w:sz w:val="18"/>
               </w:rPr>
-              <w:t>- Atenção: ___</w:t>
+              <w:t>- Ação feita ou necessária: ___</w:t>
             </w:r>
           </w:p>
           <w:p>
@@ -2642,7 +1804,7 @@
                 <w:rFonts w:ascii="Aptos Mono" w:hAnsi="Aptos Mono"/>
                 <w:sz w:val="18"/>
               </w:rPr>
-              <w:t>- Faturamento: R$ ___</w:t>
+              <w:t>- Pedidos pendentes: ___</w:t>
             </w:r>
           </w:p>
           <w:p>
@@ -2654,7 +1816,7 @@
                 <w:rFonts w:ascii="Aptos Mono" w:hAnsi="Aptos Mono"/>
                 <w:sz w:val="18"/>
               </w:rPr>
-              <w:t>- Pedidos: ___</w:t>
+              <w:t>- Mensagens pendentes: ___</w:t>
             </w:r>
           </w:p>
           <w:p>
@@ -2666,7 +1828,7 @@
                 <w:rFonts w:ascii="Aptos Mono" w:hAnsi="Aptos Mono"/>
                 <w:sz w:val="18"/>
               </w:rPr>
-              <w:t>- Produto destaque: ___</w:t>
+              <w:t>- Produtos/anúncios com atenção: ___</w:t>
             </w:r>
           </w:p>
           <w:p>
@@ -2678,7 +1840,7 @@
                 <w:rFonts w:ascii="Aptos Mono" w:hAnsi="Aptos Mono"/>
                 <w:sz w:val="18"/>
               </w:rPr>
-              <w:t>- Atenção: ___</w:t>
+              <w:t>- Ação feita ou necessária: ___</w:t>
             </w:r>
           </w:p>
           <w:p>
@@ -2713,7 +1875,7 @@
                 <w:rFonts w:ascii="Aptos Mono" w:hAnsi="Aptos Mono"/>
                 <w:sz w:val="18"/>
               </w:rPr>
-              <w:t>- Shopee total: R$ ___ / ___ pedidos</w:t>
+              <w:t>- Principal problema do dia: ___</w:t>
             </w:r>
           </w:p>
           <w:p>
@@ -2725,7 +1887,7 @@
                 <w:rFonts w:ascii="Aptos Mono" w:hAnsi="Aptos Mono"/>
                 <w:sz w:val="18"/>
               </w:rPr>
-              <w:t>- Principal variação: ___</w:t>
+              <w:t>- O que precisa de validação: ___</w:t>
             </w:r>
           </w:p>
           <w:p>
@@ -2737,12 +1899,13 @@
                 <w:rFonts w:ascii="Aptos Mono" w:hAnsi="Aptos Mono"/>
                 <w:sz w:val="18"/>
               </w:rPr>
-              <w:t>- Ação sugerida: ___</w:t>
+              <w:t>- Prints/anexos enviados: sim/não</w:t>
             </w:r>
           </w:p>
         </w:tc>
       </w:tr>
     </w:tbl>
+    <w:p/>
     <w:p>
       <w:pPr>
         <w:pStyle w:val="Heading1"/>
@@ -2799,7 +1962,7 @@
         <w:ind w:left="317"/>
       </w:pPr>
       <w:r>
-        <w:t>Entender quem é responsável por cada frente.</w:t>
+        <w:t>Entender onde ficam pedidos, mensagens, anúncios e campanhas.</w:t>
       </w:r>
     </w:p>
     <w:p>
@@ -2818,7 +1981,46 @@
         <w:ind w:left="317"/>
       </w:pPr>
       <w:r>
-        <w:t>Fazer o resumo diário das 3 contas.</w:t>
+        <w:t>Ler a análise diária enviada pelo Pedro.</w:t>
+      </w:r>
+    </w:p>
+    <w:p>
+      <w:pPr>
+        <w:pStyle w:val="ListBullet"/>
+        <w:spacing w:after="60"/>
+        <w:ind w:left="317"/>
+      </w:pPr>
+      <w:r>
+        <w:t>Conferir os pontos citados no Seller Center.</w:t>
+      </w:r>
+    </w:p>
+    <w:p>
+      <w:pPr>
+        <w:pStyle w:val="ListBullet"/>
+        <w:spacing w:after="60"/>
+        <w:ind w:left="317"/>
+      </w:pPr>
+      <w:r>
+        <w:t>Fazer o resumo operacional das 3 contas.</w:t>
+      </w:r>
+    </w:p>
+    <w:p>
+      <w:pPr>
+        <w:pStyle w:val="ListBullet"/>
+        <w:spacing w:after="60"/>
+        <w:ind w:left="317"/>
+      </w:pPr>
+      <w:r>
+        <w:t>Separar dúvidas sobre produto, anúncio e estoque.</w:t>
+      </w:r>
+    </w:p>
+    <w:p>
+      <w:pPr>
+        <w:pStyle w:val="Heading2"/>
+        <w:spacing w:before="160" w:after="80"/>
+      </w:pPr>
+      <w:r>
+        <w:t>Dias 4 e 5</w:t>
       </w:r>
     </w:p>
     <w:p>
@@ -2838,46 +2040,17 @@
         <w:ind w:left="317"/>
       </w:pPr>
       <w:r>
-        <w:t>Separar dúvidas sobre preço, estoque e campanhas.</w:t>
+        <w:t>Identificar produtos com problema recorrente.</w:t>
       </w:r>
     </w:p>
     <w:p>
       <w:pPr>
-        <w:pStyle w:val="Heading2"/>
-        <w:spacing w:before="160" w:after="80"/>
-      </w:pPr>
-      <w:r>
-        <w:t>Dias 4 e 5</w:t>
-      </w:r>
-    </w:p>
-    <w:p>
-      <w:pPr>
         <w:pStyle w:val="ListBullet"/>
         <w:spacing w:after="60"/>
         <w:ind w:left="317"/>
       </w:pPr>
       <w:r>
-        <w:t>Comparar os números da semana.</w:t>
-      </w:r>
-    </w:p>
-    <w:p>
-      <w:pPr>
-        <w:pStyle w:val="ListBullet"/>
-        <w:spacing w:after="60"/>
-        <w:ind w:left="317"/>
-      </w:pPr>
-      <w:r>
-        <w:t>Apontar contas ou produtos com queda.</w:t>
-      </w:r>
-    </w:p>
-    <w:p>
-      <w:pPr>
-        <w:pStyle w:val="ListBullet"/>
-        <w:spacing w:after="60"/>
-        <w:ind w:left="317"/>
-      </w:pPr>
-      <w:r>
-        <w:t>Montar primeira lista de oportunidades simples.</w:t>
+        <w:t>Montar lista simples de pontos de atenção.</w:t>
       </w:r>
     </w:p>
     <w:p>
@@ -2916,7 +2089,7 @@
         <w:ind w:left="317"/>
       </w:pPr>
       <w:r>
-        <w:t>Listar 5 pontos de atenção.</w:t>
+        <w:t>Listar 5 problemas ou riscos operacionais.</w:t>
       </w:r>
     </w:p>
     <w:p>
@@ -2975,7 +2148,7 @@
               <w:spacing w:after="40"/>
             </w:pPr>
             <w:r>
-              <w:t>• Compare com contexto.</w:t>
+              <w:t>• Use a análise diária do Pedro como guia.</w:t>
             </w:r>
           </w:p>
           <w:p>
@@ -2983,7 +2156,7 @@
               <w:spacing w:after="40"/>
             </w:pPr>
             <w:r>
-              <w:t>• Não mexa em preço/campanha sem validar margem.</w:t>
+              <w:t>• Confira operação antes de sugerir mudança.</w:t>
             </w:r>
           </w:p>
           <w:p>
@@ -2991,7 +2164,7 @@
               <w:spacing w:after="40"/>
             </w:pPr>
             <w:r>
-              <w:t>• Avise cedo sobre estoque e queda de venda.</w:t>
+              <w:t>• Não altere preço, campanha ou anúncio importante sem validar.</w:t>
             </w:r>
           </w:p>
           <w:p>
@@ -2999,7 +2172,7 @@
               <w:spacing w:after="40"/>
             </w:pPr>
             <w:r>
-              <w:t>• Faturamento é bom, mas lucro e operação importam mais.</w:t>
+              <w:t>• Avise cedo sobre estoque, pedido atrasado e problema de anúncio.</w:t>
             </w:r>
           </w:p>
         </w:tc>
@@ -3029,7 +2202,7 @@
         <w:color w:val="787878"/>
         <w:sz w:val="16"/>
       </w:rPr>
-      <w:t>Budamix / GB Importadora — Manual interno enxuto</w:t>
+      <w:t>Budamix / GB Importadora — Manual interno operacional</w:t>
     </w:r>
   </w:p>
 </w:ftr>
@@ -3752,11 +2925,10 @@
     </w:pPr>
     <w:rPr>
       <w:rFonts w:asciiTheme="majorHAnsi" w:eastAsiaTheme="majorEastAsia" w:hAnsiTheme="majorHAnsi" w:cstheme="majorBidi" w:ascii="Aptos Display" w:hAnsi="Aptos Display" w:eastAsia="Aptos Display"/>
-      <w:b/>
       <w:color w:val="17365D" w:themeColor="text2" w:themeShade="BF"/>
       <w:spacing w:val="5"/>
       <w:kern w:val="28"/>
-      <w:sz w:val="48"/>
+      <w:sz w:val="52"/>
       <w:szCs w:val="52"/>
     </w:rPr>
   </w:style>

</xml_diff>

<commit_message>
remove relatorio diario do manual shopee
</commit_message>
<xml_diff>
--- a/outputs/manual-onboarding-analista-shopee-budamix.docx
+++ b/outputs/manual-onboarding-analista-shopee-budamix.docx
@@ -90,7 +90,7 @@
               <w:spacing w:after="40"/>
             </w:pPr>
             <w:r>
-              <w:t>• Mostrar o que olhar, o que registrar e quando pedir ajuda.</w:t>
+              <w:t>• Mostrar o que olhar, o que conferir e quando pedir ajuda.</w:t>
             </w:r>
           </w:p>
           <w:p>
@@ -98,7 +98,7 @@
               <w:spacing w:after="40"/>
             </w:pPr>
             <w:r>
-              <w:t>• Manter o foco em operação. A análise financeira fica com o Pedro.</w:t>
+              <w:t>• Manter o foco em operação. A análise financeira e os relatórios ficam com o Pedro.</w:t>
             </w:r>
           </w:p>
         </w:tc>
@@ -593,7 +593,7 @@
               <w:spacing w:after="40"/>
             </w:pPr>
             <w:r>
-              <w:t>• Seu papel é conferir, executar e sinalizar problemas práticos.</w:t>
+              <w:t>• Seu papel é conferir, executar e sinalizar problemas práticos quando eles aparecerem.</w:t>
             </w:r>
           </w:p>
         </w:tc>
@@ -794,7 +794,7 @@
         <w:ind w:left="317"/>
       </w:pPr>
       <w:r>
-        <w:t>Registrar dúvidas recorrentes dos clientes.</w:t>
+        <w:t>Registrar dúvidas recorrentes dos clientes para alinhamento interno.</w:t>
       </w:r>
     </w:p>
     <w:p>
@@ -974,7 +974,7 @@
         <w:rPr>
           <w:b w:val="0"/>
         </w:rPr>
-        <w:t>Uma vez por semana, faça uma revisão operacional simples.</w:t>
+        <w:t>Uma vez por semana, faça uma revisão operacional simples para orientar prioridades internas.</w:t>
       </w:r>
     </w:p>
     <w:p>
@@ -1538,7 +1538,7 @@
         <w:ind w:left="317"/>
       </w:pPr>
       <w:r>
-        <w:t>Registrar números operacionais.</w:t>
+        <w:t>Conferir pedidos e mensagens.</w:t>
       </w:r>
     </w:p>
     <w:p>
@@ -1578,7 +1578,7 @@
         <w:ind w:left="317"/>
       </w:pPr>
       <w:r>
-        <w:t>Preparar resumo semanal.</w:t>
+        <w:t>Organizar dúvidas para alinhamento interno.</w:t>
       </w:r>
     </w:p>
     <w:p>
@@ -1587,332 +1587,7 @@
         <w:spacing w:before="240" w:after="120"/>
       </w:pPr>
       <w:r>
-        <w:t>8. Modelo de resumo operacional diário</w:t>
-      </w:r>
-    </w:p>
-    <w:p>
-      <w:pPr>
-        <w:spacing w:after="100" w:line="269" w:lineRule="auto"/>
-      </w:pPr>
-      <w:r>
-        <w:rPr>
-          <w:b w:val="0"/>
-        </w:rPr>
-        <w:t>Use este formato para devolver o acompanhamento do dia.</w:t>
-      </w:r>
-    </w:p>
-    <w:tbl>
-      <w:tblPr>
-        <w:tblW w:type="auto" w:w="0"/>
-        <w:tblLook w:firstColumn="1" w:firstRow="1" w:lastColumn="0" w:lastRow="0" w:noHBand="0" w:noVBand="1" w:val="04A0"/>
-      </w:tblPr>
-      <w:tblGrid>
-        <w:gridCol w:w="10080"/>
-      </w:tblGrid>
-      <w:tr>
-        <w:tc>
-          <w:tcPr>
-            <w:tcW w:type="dxa" w:w="10080"/>
-            <w:shd w:fill="F6F6F6"/>
-          </w:tcPr>
-          <w:p>
-            <w:r/>
-          </w:p>
-          <w:p>
-            <w:pPr>
-              <w:spacing w:after="20"/>
-            </w:pPr>
-            <w:r>
-              <w:rPr>
-                <w:rFonts w:ascii="Aptos Mono" w:hAnsi="Aptos Mono"/>
-                <w:sz w:val="18"/>
-              </w:rPr>
-              <w:t>Data:</w:t>
-            </w:r>
-          </w:p>
-          <w:p>
-            <w:pPr>
-              <w:spacing w:after="20"/>
-            </w:pPr>
-            <w:r>
-              <w:rPr>
-                <w:rFonts w:ascii="Aptos Mono" w:hAnsi="Aptos Mono"/>
-                <w:sz w:val="18"/>
-              </w:rPr>
-            </w:r>
-          </w:p>
-          <w:p>
-            <w:pPr>
-              <w:spacing w:after="20"/>
-            </w:pPr>
-            <w:r>
-              <w:rPr>
-                <w:rFonts w:ascii="Aptos Mono" w:hAnsi="Aptos Mono"/>
-                <w:sz w:val="18"/>
-              </w:rPr>
-              <w:t>Budamix Store / budamix.store</w:t>
-            </w:r>
-          </w:p>
-          <w:p>
-            <w:pPr>
-              <w:spacing w:after="20"/>
-            </w:pPr>
-            <w:r>
-              <w:rPr>
-                <w:rFonts w:ascii="Aptos Mono" w:hAnsi="Aptos Mono"/>
-                <w:sz w:val="18"/>
-              </w:rPr>
-              <w:t>- Pedidos pendentes: ___</w:t>
-            </w:r>
-          </w:p>
-          <w:p>
-            <w:pPr>
-              <w:spacing w:after="20"/>
-            </w:pPr>
-            <w:r>
-              <w:rPr>
-                <w:rFonts w:ascii="Aptos Mono" w:hAnsi="Aptos Mono"/>
-                <w:sz w:val="18"/>
-              </w:rPr>
-              <w:t>- Mensagens pendentes: ___</w:t>
-            </w:r>
-          </w:p>
-          <w:p>
-            <w:pPr>
-              <w:spacing w:after="20"/>
-            </w:pPr>
-            <w:r>
-              <w:rPr>
-                <w:rFonts w:ascii="Aptos Mono" w:hAnsi="Aptos Mono"/>
-                <w:sz w:val="18"/>
-              </w:rPr>
-              <w:t>- Produtos/anúncios com atenção: ___</w:t>
-            </w:r>
-          </w:p>
-          <w:p>
-            <w:pPr>
-              <w:spacing w:after="20"/>
-            </w:pPr>
-            <w:r>
-              <w:rPr>
-                <w:rFonts w:ascii="Aptos Mono" w:hAnsi="Aptos Mono"/>
-                <w:sz w:val="18"/>
-              </w:rPr>
-              <w:t>- Ação feita ou necessária: ___</w:t>
-            </w:r>
-          </w:p>
-          <w:p>
-            <w:pPr>
-              <w:spacing w:after="20"/>
-            </w:pPr>
-            <w:r>
-              <w:rPr>
-                <w:rFonts w:ascii="Aptos Mono" w:hAnsi="Aptos Mono"/>
-                <w:sz w:val="18"/>
-              </w:rPr>
-            </w:r>
-          </w:p>
-          <w:p>
-            <w:pPr>
-              <w:spacing w:after="20"/>
-            </w:pPr>
-            <w:r>
-              <w:rPr>
-                <w:rFonts w:ascii="Aptos Mono" w:hAnsi="Aptos Mono"/>
-                <w:sz w:val="18"/>
-              </w:rPr>
-              <w:t>Budamix Oficial / budamix_store</w:t>
-            </w:r>
-          </w:p>
-          <w:p>
-            <w:pPr>
-              <w:spacing w:after="20"/>
-            </w:pPr>
-            <w:r>
-              <w:rPr>
-                <w:rFonts w:ascii="Aptos Mono" w:hAnsi="Aptos Mono"/>
-                <w:sz w:val="18"/>
-              </w:rPr>
-              <w:t>- Pedidos pendentes: ___</w:t>
-            </w:r>
-          </w:p>
-          <w:p>
-            <w:pPr>
-              <w:spacing w:after="20"/>
-            </w:pPr>
-            <w:r>
-              <w:rPr>
-                <w:rFonts w:ascii="Aptos Mono" w:hAnsi="Aptos Mono"/>
-                <w:sz w:val="18"/>
-              </w:rPr>
-              <w:t>- Mensagens pendentes: ___</w:t>
-            </w:r>
-          </w:p>
-          <w:p>
-            <w:pPr>
-              <w:spacing w:after="20"/>
-            </w:pPr>
-            <w:r>
-              <w:rPr>
-                <w:rFonts w:ascii="Aptos Mono" w:hAnsi="Aptos Mono"/>
-                <w:sz w:val="18"/>
-              </w:rPr>
-              <w:t>- Produtos/anúncios com atenção: ___</w:t>
-            </w:r>
-          </w:p>
-          <w:p>
-            <w:pPr>
-              <w:spacing w:after="20"/>
-            </w:pPr>
-            <w:r>
-              <w:rPr>
-                <w:rFonts w:ascii="Aptos Mono" w:hAnsi="Aptos Mono"/>
-                <w:sz w:val="18"/>
-              </w:rPr>
-              <w:t>- Ação feita ou necessária: ___</w:t>
-            </w:r>
-          </w:p>
-          <w:p>
-            <w:pPr>
-              <w:spacing w:after="20"/>
-            </w:pPr>
-            <w:r>
-              <w:rPr>
-                <w:rFonts w:ascii="Aptos Mono" w:hAnsi="Aptos Mono"/>
-                <w:sz w:val="18"/>
-              </w:rPr>
-            </w:r>
-          </w:p>
-          <w:p>
-            <w:pPr>
-              <w:spacing w:after="20"/>
-            </w:pPr>
-            <w:r>
-              <w:rPr>
-                <w:rFonts w:ascii="Aptos Mono" w:hAnsi="Aptos Mono"/>
-                <w:sz w:val="18"/>
-              </w:rPr>
-              <w:t>Budamix Shop / budamix.shop</w:t>
-            </w:r>
-          </w:p>
-          <w:p>
-            <w:pPr>
-              <w:spacing w:after="20"/>
-            </w:pPr>
-            <w:r>
-              <w:rPr>
-                <w:rFonts w:ascii="Aptos Mono" w:hAnsi="Aptos Mono"/>
-                <w:sz w:val="18"/>
-              </w:rPr>
-              <w:t>- Pedidos pendentes: ___</w:t>
-            </w:r>
-          </w:p>
-          <w:p>
-            <w:pPr>
-              <w:spacing w:after="20"/>
-            </w:pPr>
-            <w:r>
-              <w:rPr>
-                <w:rFonts w:ascii="Aptos Mono" w:hAnsi="Aptos Mono"/>
-                <w:sz w:val="18"/>
-              </w:rPr>
-              <w:t>- Mensagens pendentes: ___</w:t>
-            </w:r>
-          </w:p>
-          <w:p>
-            <w:pPr>
-              <w:spacing w:after="20"/>
-            </w:pPr>
-            <w:r>
-              <w:rPr>
-                <w:rFonts w:ascii="Aptos Mono" w:hAnsi="Aptos Mono"/>
-                <w:sz w:val="18"/>
-              </w:rPr>
-              <w:t>- Produtos/anúncios com atenção: ___</w:t>
-            </w:r>
-          </w:p>
-          <w:p>
-            <w:pPr>
-              <w:spacing w:after="20"/>
-            </w:pPr>
-            <w:r>
-              <w:rPr>
-                <w:rFonts w:ascii="Aptos Mono" w:hAnsi="Aptos Mono"/>
-                <w:sz w:val="18"/>
-              </w:rPr>
-              <w:t>- Ação feita ou necessária: ___</w:t>
-            </w:r>
-          </w:p>
-          <w:p>
-            <w:pPr>
-              <w:spacing w:after="20"/>
-            </w:pPr>
-            <w:r>
-              <w:rPr>
-                <w:rFonts w:ascii="Aptos Mono" w:hAnsi="Aptos Mono"/>
-                <w:sz w:val="18"/>
-              </w:rPr>
-            </w:r>
-          </w:p>
-          <w:p>
-            <w:pPr>
-              <w:spacing w:after="20"/>
-            </w:pPr>
-            <w:r>
-              <w:rPr>
-                <w:rFonts w:ascii="Aptos Mono" w:hAnsi="Aptos Mono"/>
-                <w:sz w:val="18"/>
-              </w:rPr>
-              <w:t>Resumo geral</w:t>
-            </w:r>
-          </w:p>
-          <w:p>
-            <w:pPr>
-              <w:spacing w:after="20"/>
-            </w:pPr>
-            <w:r>
-              <w:rPr>
-                <w:rFonts w:ascii="Aptos Mono" w:hAnsi="Aptos Mono"/>
-                <w:sz w:val="18"/>
-              </w:rPr>
-              <w:t>- Principal problema do dia: ___</w:t>
-            </w:r>
-          </w:p>
-          <w:p>
-            <w:pPr>
-              <w:spacing w:after="20"/>
-            </w:pPr>
-            <w:r>
-              <w:rPr>
-                <w:rFonts w:ascii="Aptos Mono" w:hAnsi="Aptos Mono"/>
-                <w:sz w:val="18"/>
-              </w:rPr>
-              <w:t>- O que precisa de validação: ___</w:t>
-            </w:r>
-          </w:p>
-          <w:p>
-            <w:pPr>
-              <w:spacing w:after="20"/>
-            </w:pPr>
-            <w:r>
-              <w:rPr>
-                <w:rFonts w:ascii="Aptos Mono" w:hAnsi="Aptos Mono"/>
-                <w:sz w:val="18"/>
-              </w:rPr>
-              <w:t>- Prints/anexos enviados: sim/não</w:t>
-            </w:r>
-          </w:p>
-        </w:tc>
-      </w:tr>
-    </w:tbl>
-    <w:p/>
-    <w:p>
-      <w:pPr>
-        <w:pStyle w:val="Heading1"/>
-        <w:spacing w:before="240" w:after="120"/>
-      </w:pPr>
-      <w:r>
-        <w:t>9. Primeiros 7 dias</w:t>
+        <w:t>8. Primeiros 7 dias</w:t>
       </w:r>
     </w:p>
     <w:p>
@@ -2001,7 +1676,7 @@
         <w:ind w:left="317"/>
       </w:pPr>
       <w:r>
-        <w:t>Fazer o resumo operacional das 3 contas.</w:t>
+        <w:t>Separar dúvidas sobre produto, anúncio e estoque.</w:t>
       </w:r>
     </w:p>
     <w:p>
@@ -2011,7 +1686,7 @@
         <w:ind w:left="317"/>
       </w:pPr>
       <w:r>
-        <w:t>Separar dúvidas sobre produto, anúncio e estoque.</w:t>
+        <w:t>Entender quais ações precisam de validação antes de executar.</w:t>
       </w:r>
     </w:p>
     <w:p>
@@ -2050,7 +1725,7 @@
         <w:ind w:left="317"/>
       </w:pPr>
       <w:r>
-        <w:t>Montar lista simples de pontos de atenção.</w:t>
+        <w:t>Montar lista simples de pontos de atenção para alinhamento interno.</w:t>
       </w:r>
     </w:p>
     <w:p>
@@ -2069,7 +1744,7 @@
         <w:ind w:left="317"/>
       </w:pPr>
       <w:r>
-        <w:t>Entregar um resumo do que entendeu.</w:t>
+        <w:t>Entender a diferença prática entre as 3 contas.</w:t>
       </w:r>
     </w:p>
     <w:p>
@@ -2079,7 +1754,7 @@
         <w:ind w:left="317"/>
       </w:pPr>
       <w:r>
-        <w:t>Listar principais produtos por conta.</w:t>
+        <w:t>Saber localizar pedidos, mensagens, anúncios, campanhas e estoque.</w:t>
       </w:r>
     </w:p>
     <w:p>
@@ -2089,7 +1764,7 @@
         <w:ind w:left="317"/>
       </w:pPr>
       <w:r>
-        <w:t>Listar 5 problemas ou riscos operacionais.</w:t>
+        <w:t>Saber quando pode agir sozinha e quando precisa escalar.</w:t>
       </w:r>
     </w:p>
     <w:p>
@@ -2099,7 +1774,7 @@
         <w:ind w:left="317"/>
       </w:pPr>
       <w:r>
-        <w:t>Listar dúvidas para alinhar com Lucas/Pedro.</w:t>
+        <w:t>Levar dúvidas para alinhar com Lucas/Pedro.</w:t>
       </w:r>
     </w:p>
     <w:p>
@@ -2108,7 +1783,7 @@
         <w:spacing w:before="240" w:after="120"/>
       </w:pPr>
       <w:r>
-        <w:t>10. Frase guia</w:t>
+        <w:t>9. Frase guia</w:t>
       </w:r>
     </w:p>
     <w:tbl>

</xml_diff>